<commit_message>
fully functional app save for laetr gonna try to fix excell sheet problem
</commit_message>
<xml_diff>
--- a/Output/LetterOfNotice_Jason_Zomer_30307_KL0421.docx
+++ b/Output/LetterOfNotice_Jason_Zomer_30307_KL0421.docx
@@ -1033,6 +1033,10 @@
 </file>
 
 <file path=customXml/item1.xml><?xml version="1.0" encoding="utf-8"?>
+<b:Sources xmlns:b="http://schemas.openxmlformats.org/officeDocument/2006/bibliography" xmlns="http://schemas.openxmlformats.org/officeDocument/2006/bibliography" SelectedStyle="\APASixthEditionOfficeOnline.xsl" StyleName="APA" Version="6"/>
+</file>
+
+<file path=customXml/item2.xml><?xml version="1.0" encoding="utf-8"?>
 <?mso-contentType ?>
 <FormTemplates xmlns="http://schemas.microsoft.com/sharepoint/v3/contenttype/forms">
   <Display>DocumentLibraryForm</Display>
@@ -1041,7 +1045,7 @@
 </FormTemplates>
 </file>
 
-<file path=customXml/item2.xml><?xml version="1.0" encoding="utf-8"?>
+<file path=customXml/item3.xml><?xml version="1.0" encoding="utf-8"?>
 <ct:contentTypeSchema xmlns:ct="http://schemas.microsoft.com/office/2006/metadata/contentType" xmlns:ma="http://schemas.microsoft.com/office/2006/metadata/properties/metaAttributes" ct:_="" ma:_="" ma:contentTypeName="Document" ma:contentTypeID="0x010100F14612CBFD8E3740906A56EC3133312A" ma:contentTypeVersion="13" ma:contentTypeDescription="Create a new document." ma:contentTypeScope="" ma:versionID="b8d8bbe8caf11baa820866fa2f569c06">
   <xsd:schema xmlns:xsd="http://www.w3.org/2001/XMLSchema" xmlns:xs="http://www.w3.org/2001/XMLSchema" xmlns:p="http://schemas.microsoft.com/office/2006/metadata/properties" xmlns:ns2="88db13ce-348c-49a2-8d98-81b888e52361" xmlns:ns3="392a115a-1654-4bb7-9988-dca16703408a" targetNamespace="http://schemas.microsoft.com/office/2006/metadata/properties" ma:root="true" ma:fieldsID="823c8a0d155e31ed95da462af31d249a" ns2:_="" ns3:_="">
     <xsd:import namespace="88db13ce-348c-49a2-8d98-81b888e52361"/>
@@ -1248,7 +1252,7 @@
 </ct:contentTypeSchema>
 </file>
 
-<file path=customXml/item3.xml><?xml version="1.0" encoding="utf-8"?>
+<file path=customXml/item4.xml><?xml version="1.0" encoding="utf-8"?>
 <p:properties xmlns:p="http://schemas.microsoft.com/office/2006/metadata/properties" xmlns:xsi="http://www.w3.org/2001/XMLSchema-instance" xmlns:pc="http://schemas.microsoft.com/office/infopath/2007/PartnerControls">
   <documentManagement>
     <TaxCatchAll xmlns="392a115a-1654-4bb7-9988-dca16703408a" xsi:nil="true"/>
@@ -1259,11 +1263,15 @@
 </p:properties>
 </file>
 
-<file path=customXml/item4.xml><?xml version="1.0" encoding="utf-8"?>
-<b:Sources xmlns:b="http://schemas.openxmlformats.org/officeDocument/2006/bibliography" xmlns="http://schemas.openxmlformats.org/officeDocument/2006/bibliography" SelectedStyle="\APASixthEditionOfficeOnline.xsl" StyleName="APA" Version="6"/>
+<file path=customXml/itemProps1.xml><?xml version="1.0" encoding="utf-8"?>
+<ds:datastoreItem xmlns:ds="http://schemas.openxmlformats.org/officeDocument/2006/customXml" ds:itemID="{7070F2F0-CDE9-4786-8F9D-A923D16FA29C}">
+  <ds:schemaRefs>
+    <ds:schemaRef ds:uri="http://schemas.openxmlformats.org/officeDocument/2006/bibliography"/>
+  </ds:schemaRefs>
+</ds:datastoreItem>
 </file>
 
-<file path=customXml/itemProps1.xml><?xml version="1.0" encoding="utf-8"?>
+<file path=customXml/itemProps2.xml><?xml version="1.0" encoding="utf-8"?>
 <ds:datastoreItem xmlns:ds="http://schemas.openxmlformats.org/officeDocument/2006/customXml" ds:itemID="{6B45B415-15FC-48A0-BDEB-F98CFD88B28C}">
   <ds:schemaRefs>
     <ds:schemaRef ds:uri="http://schemas.microsoft.com/sharepoint/v3/contenttype/forms"/>
@@ -1271,7 +1279,7 @@
 </ds:datastoreItem>
 </file>
 
-<file path=customXml/itemProps2.xml><?xml version="1.0" encoding="utf-8"?>
+<file path=customXml/itemProps3.xml><?xml version="1.0" encoding="utf-8"?>
 <ds:datastoreItem xmlns:ds="http://schemas.openxmlformats.org/officeDocument/2006/customXml" ds:itemID="{86F7DB55-9F24-4061-B6F3-D424EB1E1A79}">
   <ds:schemaRefs>
     <ds:schemaRef ds:uri="http://schemas.microsoft.com/office/2006/metadata/contentType"/>
@@ -1290,7 +1298,7 @@
 </ds:datastoreItem>
 </file>
 
-<file path=customXml/itemProps3.xml><?xml version="1.0" encoding="utf-8"?>
+<file path=customXml/itemProps4.xml><?xml version="1.0" encoding="utf-8"?>
 <ds:datastoreItem xmlns:ds="http://schemas.openxmlformats.org/officeDocument/2006/customXml" ds:itemID="{F3E95AE5-798C-478C-8214-40438AE53DF2}">
   <ds:schemaRefs>
     <ds:schemaRef ds:uri="http://schemas.microsoft.com/office/2006/metadata/properties"/>
@@ -1299,12 +1307,4 @@
     <ds:schemaRef ds:uri="88db13ce-348c-49a2-8d98-81b888e52361"/>
   </ds:schemaRefs>
 </ds:datastoreItem>
-</file>
-
-<file path=customXml/itemProps4.xml><?xml version="1.0" encoding="utf-8"?>
-<ds:datastoreItem xmlns:ds="http://schemas.openxmlformats.org/officeDocument/2006/customXml" ds:itemID="{7070F2F0-CDE9-4786-8F9D-A923D16FA29C}">
-  <ds:schemaRefs>
-    <ds:schemaRef ds:uri="http://schemas.openxmlformats.org/officeDocument/2006/bibliography"/>
-  </ds:schemaRefs>
-</ds:datastoreItem>
 </file>
</xml_diff>

<commit_message>
made that a new excell file gets amde for eroros but on ly if errors exist, mad ethat it wont just overwite an excell file it wil amek aunqiue one each time informa the user that it exist
</commit_message>
<xml_diff>
--- a/Output/LetterOfNotice_Jason_Zomer_30307_KL0421.docx
+++ b/Output/LetterOfNotice_Jason_Zomer_30307_KL0421.docx
@@ -1033,10 +1033,6 @@
 </file>
 
 <file path=customXml/item1.xml><?xml version="1.0" encoding="utf-8"?>
-<b:Sources xmlns:b="http://schemas.openxmlformats.org/officeDocument/2006/bibliography" xmlns="http://schemas.openxmlformats.org/officeDocument/2006/bibliography" SelectedStyle="\APASixthEditionOfficeOnline.xsl" StyleName="APA" Version="6"/>
-</file>
-
-<file path=customXml/item2.xml><?xml version="1.0" encoding="utf-8"?>
 <?mso-contentType ?>
 <FormTemplates xmlns="http://schemas.microsoft.com/sharepoint/v3/contenttype/forms">
   <Display>DocumentLibraryForm</Display>
@@ -1045,7 +1041,7 @@
 </FormTemplates>
 </file>
 
-<file path=customXml/item3.xml><?xml version="1.0" encoding="utf-8"?>
+<file path=customXml/item2.xml><?xml version="1.0" encoding="utf-8"?>
 <ct:contentTypeSchema xmlns:ct="http://schemas.microsoft.com/office/2006/metadata/contentType" xmlns:ma="http://schemas.microsoft.com/office/2006/metadata/properties/metaAttributes" ct:_="" ma:_="" ma:contentTypeName="Document" ma:contentTypeID="0x010100F14612CBFD8E3740906A56EC3133312A" ma:contentTypeVersion="13" ma:contentTypeDescription="Create a new document." ma:contentTypeScope="" ma:versionID="b8d8bbe8caf11baa820866fa2f569c06">
   <xsd:schema xmlns:xsd="http://www.w3.org/2001/XMLSchema" xmlns:xs="http://www.w3.org/2001/XMLSchema" xmlns:p="http://schemas.microsoft.com/office/2006/metadata/properties" xmlns:ns2="88db13ce-348c-49a2-8d98-81b888e52361" xmlns:ns3="392a115a-1654-4bb7-9988-dca16703408a" targetNamespace="http://schemas.microsoft.com/office/2006/metadata/properties" ma:root="true" ma:fieldsID="823c8a0d155e31ed95da462af31d249a" ns2:_="" ns3:_="">
     <xsd:import namespace="88db13ce-348c-49a2-8d98-81b888e52361"/>
@@ -1252,7 +1248,7 @@
 </ct:contentTypeSchema>
 </file>
 
-<file path=customXml/item4.xml><?xml version="1.0" encoding="utf-8"?>
+<file path=customXml/item3.xml><?xml version="1.0" encoding="utf-8"?>
 <p:properties xmlns:p="http://schemas.microsoft.com/office/2006/metadata/properties" xmlns:xsi="http://www.w3.org/2001/XMLSchema-instance" xmlns:pc="http://schemas.microsoft.com/office/infopath/2007/PartnerControls">
   <documentManagement>
     <TaxCatchAll xmlns="392a115a-1654-4bb7-9988-dca16703408a" xsi:nil="true"/>
@@ -1263,15 +1259,11 @@
 </p:properties>
 </file>
 
-<file path=customXml/itemProps1.xml><?xml version="1.0" encoding="utf-8"?>
-<ds:datastoreItem xmlns:ds="http://schemas.openxmlformats.org/officeDocument/2006/customXml" ds:itemID="{7070F2F0-CDE9-4786-8F9D-A923D16FA29C}">
-  <ds:schemaRefs>
-    <ds:schemaRef ds:uri="http://schemas.openxmlformats.org/officeDocument/2006/bibliography"/>
-  </ds:schemaRefs>
-</ds:datastoreItem>
+<file path=customXml/item4.xml><?xml version="1.0" encoding="utf-8"?>
+<b:Sources xmlns:b="http://schemas.openxmlformats.org/officeDocument/2006/bibliography" xmlns="http://schemas.openxmlformats.org/officeDocument/2006/bibliography" SelectedStyle="\APASixthEditionOfficeOnline.xsl" StyleName="APA" Version="6"/>
 </file>
 
-<file path=customXml/itemProps2.xml><?xml version="1.0" encoding="utf-8"?>
+<file path=customXml/itemProps1.xml><?xml version="1.0" encoding="utf-8"?>
 <ds:datastoreItem xmlns:ds="http://schemas.openxmlformats.org/officeDocument/2006/customXml" ds:itemID="{6B45B415-15FC-48A0-BDEB-F98CFD88B28C}">
   <ds:schemaRefs>
     <ds:schemaRef ds:uri="http://schemas.microsoft.com/sharepoint/v3/contenttype/forms"/>
@@ -1279,7 +1271,7 @@
 </ds:datastoreItem>
 </file>
 
-<file path=customXml/itemProps3.xml><?xml version="1.0" encoding="utf-8"?>
+<file path=customXml/itemProps2.xml><?xml version="1.0" encoding="utf-8"?>
 <ds:datastoreItem xmlns:ds="http://schemas.openxmlformats.org/officeDocument/2006/customXml" ds:itemID="{86F7DB55-9F24-4061-B6F3-D424EB1E1A79}">
   <ds:schemaRefs>
     <ds:schemaRef ds:uri="http://schemas.microsoft.com/office/2006/metadata/contentType"/>
@@ -1298,7 +1290,7 @@
 </ds:datastoreItem>
 </file>
 
-<file path=customXml/itemProps4.xml><?xml version="1.0" encoding="utf-8"?>
+<file path=customXml/itemProps3.xml><?xml version="1.0" encoding="utf-8"?>
 <ds:datastoreItem xmlns:ds="http://schemas.openxmlformats.org/officeDocument/2006/customXml" ds:itemID="{F3E95AE5-798C-478C-8214-40438AE53DF2}">
   <ds:schemaRefs>
     <ds:schemaRef ds:uri="http://schemas.microsoft.com/office/2006/metadata/properties"/>
@@ -1307,4 +1299,12 @@
     <ds:schemaRef ds:uri="88db13ce-348c-49a2-8d98-81b888e52361"/>
   </ds:schemaRefs>
 </ds:datastoreItem>
+</file>
+
+<file path=customXml/itemProps4.xml><?xml version="1.0" encoding="utf-8"?>
+<ds:datastoreItem xmlns:ds="http://schemas.openxmlformats.org/officeDocument/2006/customXml" ds:itemID="{7070F2F0-CDE9-4786-8F9D-A923D16FA29C}">
+  <ds:schemaRefs>
+    <ds:schemaRef ds:uri="http://schemas.openxmlformats.org/officeDocument/2006/bibliography"/>
+  </ds:schemaRefs>
+</ds:datastoreItem>
 </file>
</xml_diff>